<commit_message>
Preenche integrantes no README e na declaração de IA
Co-Authored-By: Claude Opus 5.5 <noreply@anthropic.com>
</commit_message>
<xml_diff>
--- a/Declaracao_Uso_IA_Pratica2_VC.docx
+++ b/Declaracao_Uso_IA_Pratica2_VC.docx
@@ -2472,10 +2472,25 @@
                 <w:rFonts w:ascii="Calibri" w:hAnsi="Calibri"/>
                 <w:b w:val="0"/>
                 <w:i w:val="0"/>
-                <w:color w:val="B04500"/>
-                <w:sz w:val="21"/>
-              </w:rPr>
-              <w:t>[NOME COMPLETO — preencher]</w:t>
+                <w:color w:val="1F2A37"/>
+                <w:sz w:val="21"/>
+              </w:rPr>
+              <w:t>Pedro Soares Pereira (psp2@cesar.school)</w:t>
+            </w:r>
+          </w:p>
+          <w:p>
+            <w:pPr>
+              <w:rPr/>
+            </w:pPr>
+            <w:r>
+              <w:rPr>
+                <w:rFonts w:ascii="Calibri" w:hAnsi="Calibri"/>
+                <w:b w:val="0"/>
+                <w:i w:val="0"/>
+                <w:color w:val="1F2A37"/>
+                <w:sz w:val="21"/>
+              </w:rPr>
+              <w:t>João Pedro Lins (jplld@cesar.school)</w:t>
             </w:r>
           </w:p>
         </w:tc>
@@ -2535,6 +2550,21 @@
               <w:right w:w="160.0" w:type="dxa"/>
             </w:tcMar>
           </w:tcPr>
+          <w:p>
+            <w:pPr>
+              <w:rPr/>
+            </w:pPr>
+            <w:r>
+              <w:rPr>
+                <w:rFonts w:ascii="Calibri" w:hAnsi="Calibri"/>
+                <w:b w:val="0"/>
+                <w:i w:val="0"/>
+                <w:color w:val="B04500"/>
+                <w:sz w:val="21"/>
+              </w:rPr>
+              <w:t>[MATRÍCULA — preencher]</w:t>
+            </w:r>
+          </w:p>
           <w:p>
             <w:pPr>
               <w:rPr/>

</xml_diff>